<commit_message>
docs: prepare repository for Applied Energy submission
- Update README with final paper title and benchmark-level framing
- Align model names with paper Table 3 (BB-900K baseline, K-700, US-700)
- Add Highlights.docx, updated paper_ae.docx (DOCX submission)
- Regenerate all figures with "BB-900K baseline" legend terminology
- Remove patent files from public repo (submitted separately)
- Remove CLAUDE.md and internal project management docs
- Remove stale duplicate figures (docs/figures/)
- Add grant number to Acknowledgment section

Co-Authored-By: Claude Opus 4.6 <noreply@anthropic.com>
</commit_message>
<xml_diff>
--- a/docs/cover_letter.docx
+++ b/docs/cover_letter.docx
@@ -402,12 +402,6 @@
       </w:r>
       <w:r>
         <w:t xml:space="preserve">E-mail: jukim@smu.ac.kr</w:t>
-      </w:r>
-      <w:r>
-        <w:br/>
-      </w:r>
-      <w:r>
-        <w:t xml:space="preserve">ORCID: 0000-0002-3839-3845</w:t>
       </w:r>
     </w:p>
     <w:sectPr>

</xml_diff>